<commit_message>
vawb adversary-complaint: complete transcription of FILED-EXAMPLE-adversary-complaint (fb-w0vj.1)
Removes an invented consent paragraph the filing does not have. fb diff --content: G0 PASS (4 pages); G2 residuals template-driven (the typst template prints no title).
</commit_message>
<xml_diff>
--- a/courts/fourth-circuit/virginia/federal/bankruptcy-western-district/adversary-complaint/usage/OUTPUT-adversary-complaint.docx
+++ b/courts/fourth-circuit/virginia/federal/bankruptcy-western-district/adversary-complaint/usage/OUTPUT-adversary-complaint.docx
@@ -72,7 +72,7 @@
               <w:pStyle w:val="Single"/>
             </w:pPr>
             <w:r>
-              <w:t xml:space="preserve">James Alan Rosen</w:t>
+              <w:t xml:space="preserve">JAMES ALAN ROSEN,</w:t>
             </w:r>
           </w:p>
           <w:p>
@@ -80,7 +80,7 @@
               <w:pStyle w:val="Single"/>
             </w:pPr>
             <w:r>
-              <w:t xml:space="preserve">Robin Leslie Rosen</w:t>
+              <w:t xml:space="preserve">ROBIN LESLIE ROSEN</w:t>
             </w:r>
           </w:p>
           <w:p>
@@ -101,7 +101,7 @@
               <w:pStyle w:val="Single"/>
             </w:pPr>
             <w:r>
-              <w:t xml:space="preserve">James Alan Rosen,</w:t>
+              <w:t xml:space="preserve">JAMES ALAN ROSEN,</w:t>
             </w:r>
           </w:p>
           <w:p>
@@ -125,7 +125,7 @@
               <w:pStyle w:val="Single"/>
             </w:pPr>
             <w:r>
-              <w:t xml:space="preserve">Texas Guaranteed Student Loan Corporation (n/k/a Trellis),</w:t>
+              <w:t xml:space="preserve">TEXAS GUARANTEED STUDENT LOAN CORPORATION (n/k/a TRELLIS),</w:t>
             </w:r>
           </w:p>
           <w:p>
@@ -306,7 +306,7 @@
         <w:tab/>
       </w:r>
       <w:r>
-        <w:t xml:space="preserve">Debtor was granted a discharge on February 20, 2024 and the case was closed.</w:t>
+        <w:t xml:space="preserve">Debtor was granted a discharge on February 20, 2024and the case was closed.</w:t>
       </w:r>
     </w:p>
     <w:p>
@@ -536,20 +536,6 @@
       </w:r>
       <w:r>
         <w:t xml:space="preserve">The Plaintiff has made a good-faith effort to repay his debt owed to Texas Guaranteed Student Loan Corporation as he has sought forbearances, deferments and made payments.</w:t>
-      </w:r>
-    </w:p>
-    <w:p>
-      <w:pPr>
-        <w:pStyle w:val="NumberedPara"/>
-      </w:pPr>
-      <w:r>
-        <w:t xml:space="preserve">22.</w:t>
-      </w:r>
-      <w:r>
-        <w:tab/>
-      </w:r>
-      <w:r>
-        <w:t xml:space="preserve">[Statement under FRBP 7008(a) whether Plaintiff does or does not consent to entry of final orders or judgment by the bankruptcy court. Not in the filed complaint; counsel to state.]</w:t>
       </w:r>
     </w:p>
     <w:p>
@@ -643,7 +629,7 @@
               <w:pStyle w:val="SingleKeep"/>
             </w:pPr>
             <w:r>
-              <w:t xml:space="preserve">Telephone: (434) 951-0857</w:t>
+              <w:t xml:space="preserve">(434) 951-0857</w:t>
             </w:r>
           </w:p>
           <w:p>

</xml_diff>

<commit_message>
vawb adversary-complaint, motion-brief: typst and docx on the shared cross-engine layout model; docx/build-reference.sh and reference.docx give way to docx/reference.xml (base="xengine", {font} Times New Roman, was EB Garamond; the 1.5 in top margin of LR 5005-3(C) and LR 7001-1(C)(3) in its sectPr); 24 pt body and 13.8 pt single pitches, the page number at 10 pt where typst sets it; the complaint's typst now prints the title as the filed complaint and the docx do; caption and signature gaps as padding, which typst keeps at the top of a grid cell (the motion's second debtor and its Dated line had lost theirs); the title's smart quote in typst as in docx; the motion INPUT's unmatched closing quote typed as a closing quote; footnotes 10 pt in both engines, a paragraph with a footnote without widow control in docx; docx XENG-001..003 pass (83/83, 263/263 lines), params.cross_engine: gate (fb-595.68.19)
</commit_message>
<xml_diff>
--- a/courts/fourth-circuit/virginia/federal/bankruptcy-western-district/adversary-complaint/usage/OUTPUT-adversary-complaint.docx
+++ b/courts/fourth-circuit/virginia/federal/bankruptcy-western-district/adversary-complaint/usage/OUTPUT-adversary-complaint.docx
@@ -4,42 +4,53 @@
   <w:body>
     <w:p>
       <w:pPr>
-        <w:pStyle w:val="CourtTitle"/>
-      </w:pPr>
-      <w:r>
+        <w:spacing w:before="0" w:after="0" w:line="480" w:lineRule="exact"/>
+        <w:ind w:left="0" w:firstLine="0"/>
+        <w:jc w:val="center"/>
+      </w:pPr>
+      <w:r>
+        <w:rPr>
+          <w:b/>
+          <w:bCs/>
+        </w:rPr>
         <w:t xml:space="preserve">UNITED STATES BANKRUPTCY COURT</w:t>
       </w:r>
     </w:p>
     <w:p>
       <w:pPr>
-        <w:pStyle w:val="CourtTitle"/>
-      </w:pPr>
-      <w:r>
+        <w:spacing w:before="0" w:after="0" w:line="480" w:lineRule="exact"/>
+        <w:ind w:left="0" w:firstLine="0"/>
+        <w:jc w:val="center"/>
+      </w:pPr>
+      <w:r>
+        <w:rPr>
+          <w:b/>
+          <w:bCs/>
+        </w:rPr>
         <w:t xml:space="preserve">WESTERN DISTRICT OF VIRGINIA</w:t>
       </w:r>
     </w:p>
     <w:p>
       <w:pPr>
-        <w:pStyle w:val="Gap16"/>
+        <w:spacing w:before="0" w:after="0" w:line="480" w:lineRule="exact"/>
       </w:pPr>
     </w:p>
     <w:tbl>
       <w:tblPr>
         <w:tblW w:w="9360" w:type="dxa"/>
-        <w:tblBorders>
-          <w:top w:val="nil"/>
-          <w:left w:val="nil"/>
-          <w:bottom w:val="nil"/>
-          <w:right w:val="nil"/>
-          <w:insideH w:val="nil"/>
-          <w:insideV w:val="nil"/>
-        </w:tblBorders>
         <w:tblLayout w:type="fixed"/>
-        <w:tblLook w:val="0000" w:firstRow="0" w:lastRow="0" w:firstColumn="0" w:lastColumn="0" w:noHBand="1" w:noVBand="1"/>
+        <w:tblCellMar>
+          <w:top w:w="0" w:type="dxa"/>
+          <w:left w:w="0" w:type="dxa"/>
+          <w:bottom w:w="0" w:type="dxa"/>
+          <w:right w:w="0" w:type="dxa"/>
+        </w:tblCellMar>
+        <w:tblLook w:val="0000" w:firstRow="0" w:lastRow="0" w:firstColumn="0" w:lastColumn="0" w:noHBand="0" w:noVBand="0"/>
       </w:tblPr>
       <w:tblGrid>
         <w:gridCol w:w="5760"/>
-        <w:gridCol w:w="3600"/>
+        <w:gridCol w:w="360"/>
+        <w:gridCol w:w="3240"/>
       </w:tblGrid>
       <w:tr>
         <w:trPr>
@@ -53,15 +64,15 @@
               <w:right w:val="single" w:sz="6" w:space="0" w:color="000000"/>
             </w:tcBorders>
             <w:tcMar>
-              <w:top w:w="0" w:type="dxa"/>
-              <w:left w:w="0" w:type="dxa"/>
-              <w:bottom w:w="160" w:type="dxa"/>
-              <w:right w:w="60" w:type="dxa"/>
+              <w:bottom w:w="145" w:type="dxa"/>
+              <w:right w:w="200" w:type="dxa"/>
             </w:tcMar>
           </w:tcPr>
           <w:p>
             <w:pPr>
-              <w:pStyle w:val="Single"/>
+              <w:spacing w:before="0" w:after="0" w:line="276" w:lineRule="exact"/>
+              <w:ind w:left="0" w:firstLine="0"/>
+              <w:jc w:val="left"/>
             </w:pPr>
             <w:r>
               <w:t xml:space="preserve">In re:</w:t>
@@ -69,23 +80,53 @@
           </w:p>
           <w:p>
             <w:pPr>
-              <w:pStyle w:val="Single"/>
+              <w:spacing w:before="0" w:after="0" w:line="276" w:lineRule="exact"/>
+              <w:ind w:left="0" w:firstLine="0"/>
+              <w:jc w:val="left"/>
             </w:pPr>
             <w:r>
-              <w:t xml:space="preserve">JAMES ALAN ROSEN,</w:t>
+              <w:t xml:space="preserve">JAMES</w:t>
+            </w:r>
+            <w:r>
+              <w:t xml:space="preserve"> </w:t>
+            </w:r>
+            <w:r>
+              <w:t xml:space="preserve">ALAN</w:t>
+            </w:r>
+            <w:r>
+              <w:t xml:space="preserve"> </w:t>
+            </w:r>
+            <w:r>
+              <w:t xml:space="preserve">ROSEN,</w:t>
             </w:r>
           </w:p>
           <w:p>
             <w:pPr>
-              <w:pStyle w:val="Single"/>
+              <w:spacing w:before="0" w:after="0" w:line="276" w:lineRule="exact"/>
+              <w:ind w:left="0" w:firstLine="0"/>
+              <w:jc w:val="left"/>
             </w:pPr>
             <w:r>
-              <w:t xml:space="preserve">ROBIN LESLIE ROSEN</w:t>
+              <w:t xml:space="preserve">ROBIN</w:t>
+            </w:r>
+            <w:r>
+              <w:t xml:space="preserve"> </w:t>
+            </w:r>
+            <w:r>
+              <w:t xml:space="preserve">LESLIE</w:t>
+            </w:r>
+            <w:r>
+              <w:t xml:space="preserve"> </w:t>
+            </w:r>
+            <w:r>
+              <w:t xml:space="preserve">ROSEN</w:t>
             </w:r>
           </w:p>
           <w:p>
             <w:pPr>
-              <w:pStyle w:val="Single"/>
+              <w:spacing w:before="0" w:after="0" w:line="276" w:lineRule="exact"/>
+              <w:ind w:left="0" w:firstLine="0"/>
+              <w:jc w:val="left"/>
             </w:pPr>
             <w:r>
               <w:t xml:space="preserve">Debtors.</w:t>
@@ -93,44 +134,97 @@
           </w:p>
           <w:p>
             <w:pPr>
-              <w:pStyle w:val="Single"/>
+              <w:spacing w:before="276" w:after="0" w:line="276" w:lineRule="exact"/>
+              <w:ind w:left="0" w:firstLine="0"/>
+              <w:jc w:val="left"/>
             </w:pPr>
+            <w:r>
+              <w:t xml:space="preserve">JAMES</w:t>
+            </w:r>
+            <w:r>
+              <w:t xml:space="preserve"> </w:t>
+            </w:r>
+            <w:r>
+              <w:t xml:space="preserve">ALAN</w:t>
+            </w:r>
+            <w:r>
+              <w:t xml:space="preserve"> </w:t>
+            </w:r>
+            <w:r>
+              <w:t xml:space="preserve">ROSEN,</w:t>
+            </w:r>
           </w:p>
           <w:p>
             <w:pPr>
-              <w:pStyle w:val="Single"/>
+              <w:spacing w:before="0" w:after="0" w:line="276" w:lineRule="exact"/>
+              <w:ind w:left="0" w:firstLine="0"/>
+              <w:jc w:val="left"/>
             </w:pPr>
             <w:r>
-              <w:t xml:space="preserve">JAMES ALAN ROSEN,</w:t>
+              <w:t xml:space="preserve">Plaintiff,</w:t>
             </w:r>
           </w:p>
           <w:p>
             <w:pPr>
-              <w:pStyle w:val="Single"/>
+              <w:spacing w:before="0" w:after="0" w:line="276" w:lineRule="exact"/>
+              <w:ind w:left="0" w:firstLine="0"/>
+              <w:jc w:val="left"/>
             </w:pPr>
             <w:r>
-              <w:t xml:space="preserve">Plaintiff,</w:t>
+              <w:t xml:space="preserve">v.</w:t>
             </w:r>
           </w:p>
           <w:p>
             <w:pPr>
-              <w:pStyle w:val="Single"/>
+              <w:spacing w:before="0" w:after="0" w:line="276" w:lineRule="exact"/>
+              <w:ind w:left="0" w:firstLine="0"/>
+              <w:jc w:val="left"/>
             </w:pPr>
             <w:r>
-              <w:t xml:space="preserve">v.</w:t>
+              <w:t xml:space="preserve">TEXAS</w:t>
+            </w:r>
+            <w:r>
+              <w:t xml:space="preserve"> </w:t>
+            </w:r>
+            <w:r>
+              <w:t xml:space="preserve">GUARANTEED</w:t>
+            </w:r>
+            <w:r>
+              <w:t xml:space="preserve"> </w:t>
+            </w:r>
+            <w:r>
+              <w:t xml:space="preserve">STUDENT</w:t>
+            </w:r>
+            <w:r>
+              <w:t xml:space="preserve"> </w:t>
+            </w:r>
+            <w:r>
+              <w:t xml:space="preserve">LOAN</w:t>
+            </w:r>
+            <w:r>
+              <w:t xml:space="preserve"> </w:t>
+            </w:r>
+            <w:r>
+              <w:t xml:space="preserve">CORPORATION</w:t>
+            </w:r>
+            <w:r>
+              <w:t xml:space="preserve"> </w:t>
+            </w:r>
+            <w:r>
+              <w:t xml:space="preserve">(n/​k/​a</w:t>
+            </w:r>
+            <w:r>
+              <w:t xml:space="preserve"> </w:t>
+            </w:r>
+            <w:r>
+              <w:t xml:space="preserve">TRELLIS),</w:t>
             </w:r>
           </w:p>
           <w:p>
             <w:pPr>
-              <w:pStyle w:val="Single"/>
-            </w:pPr>
-            <w:r>
-              <w:t xml:space="preserve">TEXAS GUARANTEED STUDENT LOAN CORPORATION (n/k/a TRELLIS),</w:t>
-            </w:r>
-          </w:p>
-          <w:p>
-            <w:pPr>
-              <w:pStyle w:val="Single"/>
+              <w:spacing w:before="0" w:after="0" w:line="276" w:lineRule="exact"/>
+              <w:ind w:left="0" w:firstLine="0"/>
+              <w:jc w:val="left"/>
             </w:pPr>
             <w:r>
               <w:t xml:space="preserve">Defendant.</w:t>
@@ -139,17 +233,28 @@
         </w:tc>
         <w:tc>
           <w:tcPr>
-            <w:tcW w:w="3600" w:type="dxa"/>
+            <w:tcW w:w="360" w:type="dxa"/>
+          </w:tcPr>
+          <w:p>
+            <w:pPr>
+              <w:spacing w:before="0" w:after="0" w:line="276" w:lineRule="exact"/>
+              <w:ind w:left="0" w:firstLine="0"/>
+              <w:jc w:val="left"/>
+            </w:pPr>
+          </w:p>
+        </w:tc>
+        <w:tc>
+          <w:tcPr>
+            <w:tcW w:w="3240" w:type="dxa"/>
             <w:tcMar>
-              <w:top w:w="0" w:type="dxa"/>
-              <w:left w:w="504" w:type="dxa"/>
-              <w:bottom w:w="0" w:type="dxa"/>
-              <w:right w:w="0" w:type="dxa"/>
+              <w:left w:w="144" w:type="dxa"/>
             </w:tcMar>
           </w:tcPr>
           <w:p>
             <w:pPr>
-              <w:pStyle w:val="Single"/>
+              <w:spacing w:before="0" w:after="0" w:line="276" w:lineRule="exact"/>
+              <w:ind w:left="0" w:firstLine="0"/>
+              <w:jc w:val="left"/>
             </w:pPr>
             <w:r>
               <w:t xml:space="preserve">Chapter </w:t>
@@ -160,26 +265,39 @@
           </w:p>
           <w:p>
             <w:pPr>
-              <w:pStyle w:val="Single"/>
+              <w:spacing w:before="0" w:after="0" w:line="276" w:lineRule="exact"/>
+              <w:ind w:left="0" w:firstLine="0"/>
+              <w:jc w:val="left"/>
             </w:pPr>
             <w:r>
               <w:t xml:space="preserve">Case No. </w:t>
             </w:r>
             <w:r>
-              <w:t xml:space="preserve">23-61235</w:t>
+              <w:t xml:space="preserve">23</w:t>
+              <w:noBreakHyphen/>
+              <w:t xml:space="preserve">61235</w:t>
             </w:r>
           </w:p>
           <w:p>
             <w:pPr>
-              <w:pStyle w:val="Single"/>
+              <w:spacing w:before="276" w:after="0" w:line="276" w:lineRule="exact"/>
+              <w:ind w:left="0" w:firstLine="0"/>
+              <w:jc w:val="left"/>
             </w:pPr>
-          </w:p>
-          <w:p>
-            <w:pPr>
-              <w:pStyle w:val="Single"/>
-            </w:pPr>
-            <w:r>
-              <w:t xml:space="preserve">Adversary Pro No:</w:t>
+            <w:r>
+              <w:t xml:space="preserve">Adversary</w:t>
+            </w:r>
+            <w:r>
+              <w:t xml:space="preserve"> </w:t>
+            </w:r>
+            <w:r>
+              <w:t xml:space="preserve">Pro</w:t>
+            </w:r>
+            <w:r>
+              <w:t xml:space="preserve"> </w:t>
+            </w:r>
+            <w:r>
+              <w:t xml:space="preserve">No:</w:t>
             </w:r>
             <w:r>
               <w:t xml:space="preserve"> </w:t>
@@ -193,41 +311,68 @@
     </w:tbl>
     <w:p>
       <w:pPr>
-        <w:pStyle w:val="Gap16"/>
-      </w:pPr>
-    </w:p>
-    <w:p>
-      <w:pPr>
-        <w:pStyle w:val="CenteredHead"/>
-      </w:pPr>
-      <w:r>
+        <w:spacing w:before="0" w:after="0" w:line="480" w:lineRule="exact"/>
+      </w:pPr>
+    </w:p>
+    <w:p>
+      <w:pPr>
+        <w:spacing w:before="0" w:after="0" w:line="480" w:lineRule="exact"/>
+        <w:ind w:left="0" w:firstLine="0"/>
+        <w:jc w:val="center"/>
+      </w:pPr>
+      <w:r>
+        <w:rPr>
+          <w:b/>
+          <w:bCs/>
+        </w:rPr>
         <w:t xml:space="preserve">COMPLAINT SEEKING STUDENT LOAN DISCHARGE</w:t>
       </w:r>
     </w:p>
     <w:p>
       <w:pPr>
-        <w:pStyle w:val="Gap16"/>
-      </w:pPr>
+        <w:spacing w:before="0" w:after="0" w:line="480" w:lineRule="exact"/>
+        <w:ind w:left="0" w:firstLine="0"/>
+        <w:jc w:val="left"/>
+      </w:pPr>
+      <w:r>
+        <w:t xml:space="preserve">TO</w:t>
+      </w:r>
+      <w:r>
+        <w:t xml:space="preserve"> </w:t>
+      </w:r>
+      <w:r>
+        <w:t xml:space="preserve">THE</w:t>
+      </w:r>
+      <w:r>
+        <w:t xml:space="preserve"> </w:t>
+      </w:r>
+      <w:r>
+        <w:t xml:space="preserve">HONORABLE</w:t>
+      </w:r>
+      <w:r>
+        <w:t xml:space="preserve"> </w:t>
+      </w:r>
+      <w:r>
+        <w:t xml:space="preserve">REBECCA</w:t>
+      </w:r>
+      <w:r>
+        <w:t xml:space="preserve"> </w:t>
+      </w:r>
+      <w:r>
+        <w:t xml:space="preserve">CONNELLY:</w:t>
+      </w:r>
     </w:p>
     <w:p>
       <w:pPr>
         <w:pStyle w:val="BodyText"/>
       </w:pPr>
       <w:r>
-        <w:t xml:space="preserve">TO THE HONORABLE REBECCA CONNELLY:</w:t>
-      </w:r>
-    </w:p>
-    <w:p>
-      <w:pPr>
-        <w:pStyle w:val="FirstParagraph"/>
-      </w:pPr>
-      <w:r>
         <w:t xml:space="preserve">Comes now James Alan Rosen, Plaintiff herein, by counsel, and moves the Court for a finding that his total debt owed to the Texas Guaranteed Student Loan Corporation (Trellis) is eligible for discharge as repayment on such debt poses an undue hardship upon the plaintiff-debtor and as grounds therefore states:</w:t>
       </w:r>
     </w:p>
     <w:p>
       <w:pPr>
-        <w:pStyle w:val="NumberedPara"/>
+        <w:pStyle w:val="NumberedParagraph"/>
       </w:pPr>
       <w:r>
         <w:t xml:space="preserve">1.</w:t>
@@ -236,12 +381,12 @@
         <w:tab/>
       </w:r>
       <w:r>
-        <w:t xml:space="preserve">This is an adversary proceeding brought pursuant to Bankruptcy Rule 7001(6) and 7001(9) to determine the dischargeabilty of a debt under 11 U.S.C. § 523(a)(8).</w:t>
-      </w:r>
-    </w:p>
-    <w:p>
-      <w:pPr>
-        <w:pStyle w:val="NumberedPara"/>
+        <w:t xml:space="preserve">This is an adversary proceeding brought pursuant to Bankruptcy Rule 7001(6) and 7001(9) to determine the dischargeabilty of a debt under 11 U.S.C. § 523(a)⁠(8).</w:t>
+      </w:r>
+    </w:p>
+    <w:p>
+      <w:pPr>
+        <w:pStyle w:val="NumberedParagraph"/>
       </w:pPr>
       <w:r>
         <w:t xml:space="preserve">2.</w:t>
@@ -255,7 +400,7 @@
     </w:p>
     <w:p>
       <w:pPr>
-        <w:pStyle w:val="NumberedPara"/>
+        <w:pStyle w:val="NumberedParagraph"/>
       </w:pPr>
       <w:r>
         <w:t xml:space="preserve">3.</w:t>
@@ -264,12 +409,12 @@
         <w:tab/>
       </w:r>
       <w:r>
-        <w:t xml:space="preserve">This adversary proceeding constitutes a core proceeding as defined in title 28 U.S.C. § 157(b)(2).</w:t>
-      </w:r>
-    </w:p>
-    <w:p>
-      <w:pPr>
-        <w:pStyle w:val="NumberedPara"/>
+        <w:t xml:space="preserve">This adversary proceeding constitutes a core proceeding as defined in title 28 U.S.C. § 157(b)⁠(2).</w:t>
+      </w:r>
+    </w:p>
+    <w:p>
+      <w:pPr>
+        <w:pStyle w:val="NumberedParagraph"/>
       </w:pPr>
       <w:r>
         <w:t xml:space="preserve">4.</w:t>
@@ -283,7 +428,7 @@
     </w:p>
     <w:p>
       <w:pPr>
-        <w:pStyle w:val="NumberedPara"/>
+        <w:pStyle w:val="NumberedParagraph"/>
       </w:pPr>
       <w:r>
         <w:t xml:space="preserve">5.</w:t>
@@ -297,7 +442,7 @@
     </w:p>
     <w:p>
       <w:pPr>
-        <w:pStyle w:val="NumberedPara"/>
+        <w:pStyle w:val="NumberedParagraph"/>
       </w:pPr>
       <w:r>
         <w:t xml:space="preserve">6.</w:t>
@@ -311,7 +456,7 @@
     </w:p>
     <w:p>
       <w:pPr>
-        <w:pStyle w:val="NumberedPara"/>
+        <w:pStyle w:val="NumberedParagraph"/>
       </w:pPr>
       <w:r>
         <w:t xml:space="preserve">7.</w:t>
@@ -325,7 +470,7 @@
     </w:p>
     <w:p>
       <w:pPr>
-        <w:pStyle w:val="NumberedPara"/>
+        <w:pStyle w:val="NumberedParagraph"/>
       </w:pPr>
       <w:r>
         <w:t xml:space="preserve">8.</w:t>
@@ -348,7 +493,7 @@
     </w:p>
     <w:p>
       <w:pPr>
-        <w:pStyle w:val="NumberedPara"/>
+        <w:pStyle w:val="NumberedParagraph"/>
       </w:pPr>
       <w:r>
         <w:t xml:space="preserve">9.</w:t>
@@ -357,22 +502,20 @@
         <w:tab/>
       </w:r>
       <w:r>
-        <w:t xml:space="preserve">This complaint seeks discharge of all amounts owed to the Texas Guaranteed Student Loan Corporation (Trellis Company) as an undue hardship under 11 USC § 523(a)(8).</w:t>
+        <w:t xml:space="preserve">This complaint seeks discharge of all amounts owed to the Texas Guaranteed Student Loan Corporation (Trellis Company) as an undue hardship under 11 USC § 523(a)⁠(8).</w:t>
       </w:r>
     </w:p>
     <w:p>
       <w:pPr>
         <w:pStyle w:val="Heading1"/>
       </w:pPr>
-      <w:bookmarkStart w:id="109" w:name="_acf2bb22f08502cfc12a427def774aae29c4179"/>
       <w:r>
         <w:t xml:space="preserve">FACTS AND REQUEST FOR RELIEF</w:t>
       </w:r>
-      <w:bookmarkEnd w:id="109"/>
-    </w:p>
-    <w:p>
-      <w:pPr>
-        <w:pStyle w:val="NumberedPara"/>
+    </w:p>
+    <w:p>
+      <w:pPr>
+        <w:pStyle w:val="NumberedParagraph"/>
       </w:pPr>
       <w:r>
         <w:t xml:space="preserve">10.</w:t>
@@ -386,7 +529,7 @@
     </w:p>
     <w:p>
       <w:pPr>
-        <w:pStyle w:val="NumberedPara"/>
+        <w:pStyle w:val="NumberedParagraph"/>
       </w:pPr>
       <w:r>
         <w:t xml:space="preserve">11.</w:t>
@@ -400,7 +543,7 @@
     </w:p>
     <w:p>
       <w:pPr>
-        <w:pStyle w:val="NumberedPara"/>
+        <w:pStyle w:val="NumberedParagraph"/>
       </w:pPr>
       <w:r>
         <w:t xml:space="preserve">12.</w:t>
@@ -414,7 +557,7 @@
     </w:p>
     <w:p>
       <w:pPr>
-        <w:pStyle w:val="NumberedPara"/>
+        <w:pStyle w:val="NumberedParagraph"/>
       </w:pPr>
       <w:r>
         <w:t xml:space="preserve">13.</w:t>
@@ -428,7 +571,7 @@
     </w:p>
     <w:p>
       <w:pPr>
-        <w:pStyle w:val="NumberedPara"/>
+        <w:pStyle w:val="NumberedParagraph"/>
       </w:pPr>
       <w:r>
         <w:t xml:space="preserve">14.</w:t>
@@ -442,7 +585,7 @@
     </w:p>
     <w:p>
       <w:pPr>
-        <w:pStyle w:val="NumberedPara"/>
+        <w:pStyle w:val="NumberedParagraph"/>
       </w:pPr>
       <w:r>
         <w:t xml:space="preserve">15.</w:t>
@@ -456,7 +599,7 @@
     </w:p>
     <w:p>
       <w:pPr>
-        <w:pStyle w:val="NumberedPara"/>
+        <w:pStyle w:val="NumberedParagraph"/>
       </w:pPr>
       <w:r>
         <w:t xml:space="preserve">16.</w:t>
@@ -470,7 +613,7 @@
     </w:p>
     <w:p>
       <w:pPr>
-        <w:pStyle w:val="NumberedPara"/>
+        <w:pStyle w:val="NumberedParagraph"/>
       </w:pPr>
       <w:r>
         <w:t xml:space="preserve">17.</w:t>
@@ -479,12 +622,18 @@
         <w:tab/>
       </w:r>
       <w:r>
-        <w:t xml:space="preserve">The Plaintiff has minimal assets. See Schedule A/B. Docket Entry 1, Case 23-61235.</w:t>
-      </w:r>
-    </w:p>
-    <w:p>
-      <w:pPr>
-        <w:pStyle w:val="NumberedPara"/>
+        <w:t xml:space="preserve">The Plaintiff has minimal assets. See Schedule A/​B. Docket Entry 1, Case 23</w:t>
+      </w:r>
+      <w:r>
+        <w:noBreakHyphen/>
+      </w:r>
+      <w:r>
+        <w:t xml:space="preserve">61235.</w:t>
+      </w:r>
+    </w:p>
+    <w:p>
+      <w:pPr>
+        <w:pStyle w:val="NumberedParagraph"/>
       </w:pPr>
       <w:r>
         <w:t xml:space="preserve">18.</w:t>
@@ -498,7 +647,7 @@
     </w:p>
     <w:p>
       <w:pPr>
-        <w:pStyle w:val="NumberedPara"/>
+        <w:pStyle w:val="NumberedParagraph"/>
       </w:pPr>
       <w:r>
         <w:t xml:space="preserve">19.</w:t>
@@ -512,7 +661,7 @@
     </w:p>
     <w:p>
       <w:pPr>
-        <w:pStyle w:val="NumberedPara"/>
+        <w:pStyle w:val="NumberedParagraph"/>
       </w:pPr>
       <w:r>
         <w:t xml:space="preserve">20.</w:t>
@@ -526,7 +675,7 @@
     </w:p>
     <w:p>
       <w:pPr>
-        <w:pStyle w:val="NumberedPara"/>
+        <w:pStyle w:val="NumberedParagraph"/>
       </w:pPr>
       <w:r>
         <w:t xml:space="preserve">21.</w:t>
@@ -540,7 +689,7 @@
     </w:p>
     <w:p>
       <w:pPr>
-        <w:pStyle w:val="BodyKeep"/>
+        <w:pStyle w:val="BodyText"/>
       </w:pPr>
       <w:r>
         <w:t xml:space="preserve">Wherefore, plaintiff prays this court enter an order declaring the total debt owed by the plaintiff-debtor to the Texas Guaranteed Student Loan Corporation for the student loan(s) presents an undue hardship on the plaintiff, is therefore dischargeable, and for such further relief as may be just.</w:t>
@@ -548,22 +697,20 @@
     </w:p>
     <w:p>
       <w:pPr>
-        <w:pStyle w:val="Gap16"/>
+        <w:spacing w:before="0" w:after="0" w:line="480" w:lineRule="exact"/>
       </w:pPr>
     </w:p>
     <w:tbl>
       <w:tblPr>
         <w:tblW w:w="9360" w:type="dxa"/>
-        <w:tblBorders>
-          <w:top w:val="nil"/>
-          <w:left w:val="nil"/>
-          <w:bottom w:val="nil"/>
-          <w:right w:val="nil"/>
-          <w:insideH w:val="nil"/>
-          <w:insideV w:val="nil"/>
-        </w:tblBorders>
         <w:tblLayout w:type="fixed"/>
-        <w:tblLook w:val="0000" w:firstRow="0" w:lastRow="0" w:firstColumn="0" w:lastColumn="0" w:noHBand="1" w:noVBand="1"/>
+        <w:tblCellMar>
+          <w:top w:w="0" w:type="dxa"/>
+          <w:left w:w="0" w:type="dxa"/>
+          <w:bottom w:w="0" w:type="dxa"/>
+          <w:right w:w="0" w:type="dxa"/>
+        </w:tblCellMar>
+        <w:tblLook w:val="0000" w:firstRow="0" w:lastRow="0" w:firstColumn="0" w:lastColumn="0" w:noHBand="0" w:noVBand="0"/>
       </w:tblPr>
       <w:tblGrid>
         <w:gridCol w:w="4896"/>
@@ -577,64 +724,158 @@
         <w:tc>
           <w:tcPr>
             <w:tcW w:w="4896" w:type="dxa"/>
-            <w:tcMar>
-              <w:top w:w="0" w:type="dxa"/>
-              <w:left w:w="0" w:type="dxa"/>
-              <w:bottom w:w="0" w:type="dxa"/>
-              <w:right w:w="0" w:type="dxa"/>
-            </w:tcMar>
           </w:tcPr>
           <w:p>
             <w:pPr>
-              <w:pStyle w:val="SingleKeep"/>
+              <w:spacing w:before="0" w:after="0" w:line="276" w:lineRule="exact"/>
+              <w:ind w:left="0" w:firstLine="0"/>
+              <w:jc w:val="left"/>
             </w:pPr>
             <w:r>
-              <w:t xml:space="preserve">Lynn A. Bradley, Esquire</w:t>
+              <w:t xml:space="preserve">Lynn</w:t>
+            </w:r>
+            <w:r>
+              <w:t xml:space="preserve"> </w:t>
+            </w:r>
+            <w:r>
+              <w:t xml:space="preserve">A.</w:t>
+            </w:r>
+            <w:r>
+              <w:t xml:space="preserve"> </w:t>
+            </w:r>
+            <w:r>
+              <w:t xml:space="preserve">Bradley,</w:t>
+            </w:r>
+            <w:r>
+              <w:t xml:space="preserve"> </w:t>
+            </w:r>
+            <w:r>
+              <w:t xml:space="preserve">Esquire</w:t>
             </w:r>
           </w:p>
           <w:p>
             <w:pPr>
-              <w:pStyle w:val="SingleKeep"/>
+              <w:spacing w:before="0" w:after="0" w:line="276" w:lineRule="exact"/>
+              <w:ind w:left="0" w:firstLine="0"/>
+              <w:jc w:val="left"/>
             </w:pPr>
             <w:r>
-              <w:t xml:space="preserve">VSB # 35761</w:t>
+              <w:t xml:space="preserve">VSB</w:t>
+            </w:r>
+            <w:r>
+              <w:t xml:space="preserve"> </w:t>
+            </w:r>
+            <w:r>
+              <w:t xml:space="preserve">#</w:t>
+            </w:r>
+            <w:r>
+              <w:t xml:space="preserve"> </w:t>
+            </w:r>
+            <w:r>
+              <w:t xml:space="preserve">35761</w:t>
             </w:r>
           </w:p>
           <w:p>
             <w:pPr>
-              <w:pStyle w:val="SingleKeep"/>
+              <w:spacing w:before="0" w:after="0" w:line="276" w:lineRule="exact"/>
+              <w:ind w:left="0" w:firstLine="0"/>
+              <w:jc w:val="left"/>
             </w:pPr>
             <w:r>
-              <w:t xml:space="preserve">Tucker Griffin Barnes, PC</w:t>
+              <w:t xml:space="preserve">Tucker</w:t>
+            </w:r>
+            <w:r>
+              <w:t xml:space="preserve"> </w:t>
+            </w:r>
+            <w:r>
+              <w:t xml:space="preserve">Griffin</w:t>
+            </w:r>
+            <w:r>
+              <w:t xml:space="preserve"> </w:t>
+            </w:r>
+            <w:r>
+              <w:t xml:space="preserve">Barnes,</w:t>
+            </w:r>
+            <w:r>
+              <w:t xml:space="preserve"> </w:t>
+            </w:r>
+            <w:r>
+              <w:t xml:space="preserve">PC</w:t>
             </w:r>
           </w:p>
           <w:p>
             <w:pPr>
-              <w:pStyle w:val="SingleKeep"/>
+              <w:spacing w:before="0" w:after="0" w:line="276" w:lineRule="exact"/>
+              <w:ind w:left="0" w:firstLine="0"/>
+              <w:jc w:val="left"/>
             </w:pPr>
             <w:r>
-              <w:t xml:space="preserve">307 Rio Road West</w:t>
+              <w:t xml:space="preserve">307</w:t>
+            </w:r>
+            <w:r>
+              <w:t xml:space="preserve"> </w:t>
+            </w:r>
+            <w:r>
+              <w:t xml:space="preserve">Rio</w:t>
+            </w:r>
+            <w:r>
+              <w:t xml:space="preserve"> </w:t>
+            </w:r>
+            <w:r>
+              <w:t xml:space="preserve">Road</w:t>
+            </w:r>
+            <w:r>
+              <w:t xml:space="preserve"> </w:t>
+            </w:r>
+            <w:r>
+              <w:t xml:space="preserve">West</w:t>
             </w:r>
           </w:p>
           <w:p>
             <w:pPr>
-              <w:pStyle w:val="SingleKeep"/>
+              <w:spacing w:before="0" w:after="0" w:line="276" w:lineRule="exact"/>
+              <w:ind w:left="0" w:firstLine="0"/>
+              <w:jc w:val="left"/>
             </w:pPr>
             <w:r>
-              <w:t xml:space="preserve">Charlottesville, Virginia 22901</w:t>
+              <w:t xml:space="preserve">Charlottesville,</w:t>
+            </w:r>
+            <w:r>
+              <w:t xml:space="preserve"> </w:t>
+            </w:r>
+            <w:r>
+              <w:t xml:space="preserve">Virginia</w:t>
+            </w:r>
+            <w:r>
+              <w:t xml:space="preserve"> </w:t>
+            </w:r>
+            <w:r>
+              <w:t xml:space="preserve">22901</w:t>
             </w:r>
           </w:p>
           <w:p>
             <w:pPr>
-              <w:pStyle w:val="SingleKeep"/>
+              <w:spacing w:before="0" w:after="0" w:line="276" w:lineRule="exact"/>
+              <w:ind w:left="0" w:firstLine="0"/>
+              <w:jc w:val="left"/>
             </w:pPr>
             <w:r>
-              <w:t xml:space="preserve">(434) 951-0857</w:t>
+              <w:t xml:space="preserve">(434)</w:t>
+            </w:r>
+            <w:r>
+              <w:t xml:space="preserve"> </w:t>
+            </w:r>
+            <w:r>
+              <w:t xml:space="preserve">951</w:t>
+              <w:noBreakHyphen/>
+              <w:t xml:space="preserve">0857</w:t>
             </w:r>
           </w:p>
           <w:p>
             <w:pPr>
-              <w:pStyle w:val="SingleKeep"/>
+              <w:spacing w:before="0" w:after="0" w:line="276" w:lineRule="exact"/>
+              <w:ind w:left="0" w:firstLine="0"/>
+              <w:jc w:val="left"/>
             </w:pPr>
             <w:r>
               <w:t xml:space="preserve">lbradley@tgblaw.com</w:t>
@@ -644,32 +885,24 @@
         <w:tc>
           <w:tcPr>
             <w:tcW w:w="288" w:type="dxa"/>
-            <w:tcMar>
-              <w:top w:w="0" w:type="dxa"/>
-              <w:left w:w="0" w:type="dxa"/>
-              <w:bottom w:w="0" w:type="dxa"/>
-              <w:right w:w="0" w:type="dxa"/>
-            </w:tcMar>
           </w:tcPr>
           <w:p>
             <w:pPr>
-              <w:pStyle w:val="SingleKeep"/>
+              <w:spacing w:before="0" w:after="0" w:line="276" w:lineRule="exact"/>
+              <w:ind w:left="0" w:firstLine="0"/>
+              <w:jc w:val="left"/>
             </w:pPr>
           </w:p>
         </w:tc>
         <w:tc>
           <w:tcPr>
             <w:tcW w:w="4176" w:type="dxa"/>
-            <w:tcMar>
-              <w:top w:w="0" w:type="dxa"/>
-              <w:left w:w="0" w:type="dxa"/>
-              <w:bottom w:w="0" w:type="dxa"/>
-              <w:right w:w="0" w:type="dxa"/>
-            </w:tcMar>
           </w:tcPr>
           <w:p>
             <w:pPr>
-              <w:pStyle w:val="SingleKeep"/>
+              <w:spacing w:before="0" w:after="0" w:line="276" w:lineRule="exact"/>
+              <w:ind w:left="0" w:firstLine="0"/>
+              <w:jc w:val="left"/>
             </w:pPr>
             <w:r>
               <w:t xml:space="preserve">Respectfully submitted,</w:t>
@@ -677,36 +910,44 @@
           </w:p>
           <w:p>
             <w:pPr>
-              <w:pStyle w:val="SingleKeep"/>
+              <w:spacing w:before="276" w:after="0" w:line="276" w:lineRule="exact"/>
+              <w:ind w:left="0" w:firstLine="0"/>
+              <w:jc w:val="left"/>
             </w:pPr>
+            <w:r>
+              <w:t xml:space="preserve">JAMES ALAN ROSEN</w:t>
+            </w:r>
           </w:p>
           <w:p>
             <w:pPr>
-              <w:pStyle w:val="SingleKeep"/>
+              <w:spacing w:before="276" w:after="0" w:line="276" w:lineRule="exact"/>
+              <w:ind w:left="0" w:firstLine="0"/>
+              <w:jc w:val="left"/>
             </w:pPr>
             <w:r>
-              <w:t xml:space="preserve">JAMES ALAN ROSEN</w:t>
+              <w:t xml:space="preserve">BY: /s/ </w:t>
+            </w:r>
+            <w:r>
+              <w:t xml:space="preserve">Lynn</w:t>
+            </w:r>
+            <w:r>
+              <w:t xml:space="preserve"> </w:t>
+            </w:r>
+            <w:r>
+              <w:t xml:space="preserve">A.</w:t>
+            </w:r>
+            <w:r>
+              <w:t xml:space="preserve"> </w:t>
+            </w:r>
+            <w:r>
+              <w:t xml:space="preserve">Bradley</w:t>
             </w:r>
           </w:p>
           <w:p>
             <w:pPr>
-              <w:pStyle w:val="SingleKeep"/>
-            </w:pPr>
-          </w:p>
-          <w:p>
-            <w:pPr>
-              <w:pStyle w:val="SingleKeep"/>
-            </w:pPr>
-            <w:r>
-              <w:t xml:space="preserve">BY: /s/ </w:t>
-            </w:r>
-            <w:r>
-              <w:t xml:space="preserve">Lynn A. Bradley</w:t>
-            </w:r>
-          </w:p>
-          <w:p>
-            <w:pPr>
-              <w:pStyle w:val="SingleKeep"/>
+              <w:spacing w:before="0" w:after="0" w:line="276" w:lineRule="exact"/>
+              <w:ind w:left="0" w:firstLine="0"/>
+              <w:jc w:val="left"/>
             </w:pPr>
             <w:r>
               <w:t xml:space="preserve">Counsel</w:t>
@@ -717,12 +958,16 @@
     </w:tbl>
     <w:p>
       <w:pPr>
-        <w:pStyle w:val="Gap16"/>
-      </w:pPr>
-    </w:p>
-    <w:p>
-      <w:pPr>
-        <w:pStyle w:val="SingleKeep"/>
+        <w:spacing w:before="0" w:after="0" w:line="480" w:lineRule="exact"/>
+      </w:pPr>
+    </w:p>
+    <w:p>
+      <w:pPr>
+        <w:keepNext/>
+        <w:keepLines/>
+        <w:spacing w:before="0" w:after="0" w:line="276" w:lineRule="exact"/>
+        <w:ind w:left="0" w:firstLine="0"/>
+        <w:jc w:val="left"/>
       </w:pPr>
       <w:r>
         <w:t xml:space="preserve">Service:</w:t>
@@ -730,42 +975,80 @@
     </w:p>
     <w:p>
       <w:pPr>
-        <w:pStyle w:val="Gap6"/>
-      </w:pPr>
-    </w:p>
-    <w:p>
-      <w:pPr>
-        <w:pStyle w:val="SingleKeep"/>
-      </w:pPr>
-      <w:r>
-        <w:t xml:space="preserve">Trellis Company</w:t>
-      </w:r>
-    </w:p>
-    <w:p>
-      <w:pPr>
-        <w:pStyle w:val="SingleKeep"/>
-      </w:pPr>
-      <w:r>
-        <w:t xml:space="preserve">P.O. Box 83100</w:t>
-      </w:r>
-    </w:p>
-    <w:p>
-      <w:pPr>
-        <w:pStyle w:val="SingleKeep"/>
-      </w:pPr>
-      <w:r>
-        <w:t xml:space="preserve">Round Rock, TX 78683-3100</w:t>
-      </w:r>
-    </w:p>
-    <w:p>
-      <w:pPr>
-        <w:pStyle w:val="Gap6"/>
-      </w:pPr>
+        <w:keepNext/>
+        <w:keepLines/>
+        <w:spacing w:before="120" w:after="0" w:line="276" w:lineRule="exact"/>
+        <w:ind w:left="0" w:firstLine="0"/>
+        <w:jc w:val="left"/>
+      </w:pPr>
+      <w:r>
+        <w:t xml:space="preserve">Trellis</w:t>
+      </w:r>
+      <w:r>
+        <w:t xml:space="preserve"> </w:t>
+      </w:r>
+      <w:r>
+        <w:t xml:space="preserve">Company</w:t>
+      </w:r>
+    </w:p>
+    <w:p>
+      <w:pPr>
+        <w:keepNext/>
+        <w:keepLines/>
+        <w:spacing w:before="0" w:after="0" w:line="276" w:lineRule="exact"/>
+        <w:ind w:left="0" w:firstLine="0"/>
+        <w:jc w:val="left"/>
+      </w:pPr>
+      <w:r>
+        <w:t xml:space="preserve">P.O.</w:t>
+      </w:r>
+      <w:r>
+        <w:t xml:space="preserve"> </w:t>
+      </w:r>
+      <w:r>
+        <w:t xml:space="preserve">Box</w:t>
+      </w:r>
+      <w:r>
+        <w:t xml:space="preserve"> </w:t>
+      </w:r>
+      <w:r>
+        <w:t xml:space="preserve">83100</w:t>
+      </w:r>
+    </w:p>
+    <w:p>
+      <w:pPr>
+        <w:spacing w:before="0" w:after="0" w:line="276" w:lineRule="exact"/>
+        <w:ind w:left="0" w:firstLine="0"/>
+        <w:jc w:val="left"/>
+      </w:pPr>
+      <w:r>
+        <w:t xml:space="preserve">Round</w:t>
+      </w:r>
+      <w:r>
+        <w:t xml:space="preserve"> </w:t>
+      </w:r>
+      <w:r>
+        <w:t xml:space="preserve">Rock,</w:t>
+      </w:r>
+      <w:r>
+        <w:t xml:space="preserve"> </w:t>
+      </w:r>
+      <w:r>
+        <w:t xml:space="preserve">TX</w:t>
+      </w:r>
+      <w:r>
+        <w:t xml:space="preserve"> </w:t>
+      </w:r>
+      <w:r>
+        <w:t xml:space="preserve">78683</w:t>
+        <w:noBreakHyphen/>
+        <w:t xml:space="preserve">3100</w:t>
+      </w:r>
     </w:p>
     <w:sectPr>
-      <w:footerReference w:type="default" r:id="rId100"/>
+      <w:footerReference w:type="default" r:id="rIdFooter1"/>
       <w:pgSz w:w="12240" w:h="15840"/>
-      <w:pgMar w:top="2160" w:right="1440" w:bottom="1440" w:left="1440" w:header="720" w:footer="720" w:gutter="0"/>
+      <w:pgMar w:top="2160" w:right="1440" w:bottom="1440" w:left="1440" w:header="720" w:footer="778" w:gutter="0"/>
     </w:sectPr>
   </w:body>
 </w:document>
@@ -779,22 +1062,42 @@
 <w:ftr xmlns:w="http://schemas.openxmlformats.org/wordprocessingml/2006/main" xmlns:r="http://schemas.openxmlformats.org/officeDocument/2006/relationships">
   <w:p>
     <w:pPr>
-      <w:pStyle w:val="Footer"/>
+      <w:spacing w:before="0" w:after="0" w:line="230" w:lineRule="exact"/>
       <w:jc w:val="center"/>
     </w:pPr>
     <w:r>
+      <w:rPr>
+        <w:sz w:val="20"/>
+        <w:szCs w:val="20"/>
+      </w:rPr>
       <w:fldChar w:fldCharType="begin"/>
     </w:r>
     <w:r>
+      <w:rPr>
+        <w:sz w:val="20"/>
+        <w:szCs w:val="20"/>
+      </w:rPr>
       <w:instrText xml:space="preserve"> PAGE </w:instrText>
     </w:r>
     <w:r>
+      <w:rPr>
+        <w:sz w:val="20"/>
+        <w:szCs w:val="20"/>
+      </w:rPr>
       <w:fldChar w:fldCharType="separate"/>
     </w:r>
     <w:r>
+      <w:rPr>
+        <w:sz w:val="20"/>
+        <w:szCs w:val="20"/>
+      </w:rPr>
       <w:t>1</w:t>
     </w:r>
     <w:r>
+      <w:rPr>
+        <w:sz w:val="20"/>
+        <w:szCs w:val="20"/>
+      </w:rPr>
       <w:fldChar w:fldCharType="end"/>
     </w:r>
   </w:p>
@@ -905,43 +1208,566 @@
 </file>
 
 <file path=word/styles.xml><?xml version="1.0" encoding="utf-8"?>
-<w:styles xmlns:w="http://schemas.openxmlformats.org/wordprocessingml/2006/main">
+<w:styles xmlns:r="http://schemas.openxmlformats.org/officeDocument/2006/relationships" xmlns:w="http://schemas.openxmlformats.org/wordprocessingml/2006/main">
   <w:docDefaults>
     <w:rPrDefault>
       <w:rPr>
-        <w:rFonts w:ascii="EB Garamond" w:hAnsi="EB Garamond" w:eastAsia="EB Garamond" w:cs="EB Garamond"/>
+        <w:rFonts w:ascii="Times New Roman" w:hAnsi="Times New Roman" w:eastAsia="Times New Roman" w:cs="Times New Roman"/>
         <w:sz w:val="24"/>
         <w:szCs w:val="24"/>
-        <w:lang w:val="en-US" w:eastAsia="en-US" w:bidi="ar-SA"/>
+        <w:lang w:val="en-US" w:eastAsia="zh-CN" w:bidi="ar-SA"/>
       </w:rPr>
     </w:rPrDefault>
     <w:pPrDefault>
       <w:pPr>
-        <w:spacing w:after="0" w:line="240" w:lineRule="auto"/>
+        <w:widowControl/>
+        <w:spacing w:after="0"/>
       </w:pPr>
     </w:pPrDefault>
   </w:docDefaults>
+  <w:latentStyles w:defLockedState="0" w:defUIPriority="0" w:defSemiHidden="0" w:defUnhideWhenUsed="0" w:defQFormat="0" w:count="276"/>
   <w:style w:type="paragraph" w:default="1" w:styleId="Normal">
     <w:name w:val="Normal"/>
     <w:qFormat/>
-    <w:pPr>
-      <w:widowControl/>
-    </w:pPr>
-    <w:rPr>
+  </w:style>
+  <w:style w:type="paragraph" w:styleId="BodyText">
+    <w:name w:val="Body Text"/>
+    <w:basedOn w:val="Normal"/>
+    <w:qFormat/>
+    <w:pPr>
+      <w:spacing w:before="0" w:after="0" w:line="480" w:lineRule="exact"/>
+      <w:ind w:firstLine="0"/>
+    </w:pPr>
+  </w:style>
+  <w:style w:type="paragraph" w:customStyle="1" w:styleId="FirstParagraph">
+    <w:name w:val="First Paragraph"/>
+    <w:basedOn w:val="BodyText"/>
+    <w:next w:val="BodyText"/>
+    <w:qFormat/>
+  </w:style>
+  <w:style w:type="paragraph" w:customStyle="1" w:styleId="Compact">
+    <w:name w:val="Compact"/>
+    <w:basedOn w:val="BodyText"/>
+    <w:qFormat/>
+    <w:pPr>
+      <w:spacing w:before="36" w:after="36"/>
+    </w:pPr>
+  </w:style>
+  <w:style w:type="paragraph" w:styleId="Title">
+    <w:name w:val="Title"/>
+    <w:basedOn w:val="Normal"/>
+    <w:next w:val="BodyText"/>
+    <w:link w:val="TitleChar"/>
+    <w:uiPriority w:val="10"/>
+    <w:qFormat/>
+    <w:rsid w:val="00A10FD9"/>
+    <w:pPr>
+      <w:spacing w:after="80" w:line="240" w:lineRule="auto"/>
+      <w:contextualSpacing/>
+      <w:jc w:val="center"/>
+    </w:pPr>
+    <w:rPr>
+      <w:rFonts w:asciiTheme="majorHAnsi" w:eastAsiaTheme="majorEastAsia" w:hAnsiTheme="majorHAnsi" w:cstheme="majorBidi"/>
+      <w:sz w:val="56"/>
+      <w:szCs w:val="56"/>
+    </w:rPr>
+  </w:style>
+  <w:style w:type="character" w:customStyle="1" w:styleId="TitleChar">
+    <w:name w:val="Title Char"/>
+    <w:basedOn w:val="DefaultParagraphFont"/>
+    <w:link w:val="Title"/>
+    <w:uiPriority w:val="10"/>
+    <w:rsid w:val="00A10FD9"/>
+    <w:rPr>
+      <w:rFonts w:asciiTheme="majorHAnsi" w:eastAsiaTheme="majorEastAsia" w:hAnsiTheme="majorHAnsi" w:cstheme="majorBidi"/>
+      <w:sz w:val="56"/>
+      <w:szCs w:val="56"/>
+    </w:rPr>
+  </w:style>
+  <w:style w:type="paragraph" w:styleId="Subtitle">
+    <w:name w:val="Subtitle"/>
+    <w:basedOn w:val="Title"/>
+    <w:next w:val="BodyText"/>
+    <w:link w:val="SubtitleChar"/>
+    <w:uiPriority w:val="11"/>
+    <w:qFormat/>
+    <w:rsid w:val="00A10FD9"/>
+    <w:pPr>
+      <w:numPr>
+        <w:ilvl w:val="1"/>
+      </w:numPr>
+    </w:pPr>
+    <w:rPr>
+      <w:rFonts w:eastAsiaTheme="majorEastAsia" w:cstheme="majorBidi"/>
+      <w:spacing w:val="15"/>
+      <w:sz w:val="28"/>
+      <w:szCs w:val="28"/>
+    </w:rPr>
+  </w:style>
+  <w:style w:type="character" w:customStyle="1" w:styleId="SubtitleChar">
+    <w:name w:val="Subtitle Char"/>
+    <w:basedOn w:val="DefaultParagraphFont"/>
+    <w:link w:val="Subtitle"/>
+    <w:uiPriority w:val="11"/>
+    <w:rsid w:val="00A10FD9"/>
+    <w:rPr>
+      <w:rFonts w:eastAsiaTheme="majorEastAsia" w:cstheme="majorBidi"/>
+      <w:color w:val="595959" w:themeColor="text1" w:themeTint="A6"/>
+      <w:spacing w:val="15"/>
+      <w:sz w:val="28"/>
+      <w:szCs w:val="28"/>
+    </w:rPr>
+  </w:style>
+  <w:style w:type="paragraph" w:customStyle="1" w:styleId="Author">
+    <w:name w:val="Author"/>
+    <w:basedOn w:val="Title"/>
+    <w:next w:val="BodyText"/>
+    <w:qFormat/>
+    <w:pPr>
+      <w:keepNext/>
+      <w:keepLines/>
+    </w:pPr>
+    <w:rPr>
+      <w:sz w:val="24"/>
+      <w:szCs w:val="24"/>
+    </w:rPr>
+  </w:style>
+  <w:style w:type="paragraph" w:styleId="Date">
+    <w:name w:val="Date"/>
+    <w:basedOn w:val="Title"/>
+    <w:next w:val="BodyText"/>
+    <w:qFormat/>
+    <w:pPr>
+      <w:keepNext/>
+      <w:keepLines/>
+    </w:pPr>
+    <w:rPr>
+      <w:sz w:val="24"/>
+      <w:szCs w:val="24"/>
+    </w:rPr>
+  </w:style>
+  <w:style w:type="paragraph" w:customStyle="1" w:styleId="AbstractTitle">
+    <w:name w:val="Abstract Title"/>
+    <w:basedOn w:val="Normal"/>
+    <w:next w:val="Abstract"/>
+    <w:qFormat/>
+    <w:pPr>
+      <w:keepNext/>
+      <w:keepLines/>
+      <w:spacing w:before="300" w:after="0"/>
+      <w:jc w:val="center"/>
+    </w:pPr>
+    <w:rPr>
+      <w:b/>
+      <w:sz w:val="20"/>
+      <w:szCs w:val="20"/>
+    </w:rPr>
+  </w:style>
+  <w:style w:type="paragraph" w:customStyle="1" w:styleId="Abstract">
+    <w:name w:val="Abstract"/>
+    <w:basedOn w:val="Normal"/>
+    <w:next w:val="BodyText"/>
+    <w:qFormat/>
+    <w:pPr>
+      <w:keepNext/>
+      <w:keepLines/>
+      <w:spacing w:before="100" w:after="300"/>
+    </w:pPr>
+    <w:rPr>
+      <w:sz w:val="20"/>
+      <w:szCs w:val="20"/>
+    </w:rPr>
+  </w:style>
+  <w:style w:type="paragraph" w:styleId="Bibliography">
+    <w:name w:val="Bibliography"/>
+    <w:basedOn w:val="Normal"/>
+    <w:next w:val="Bibliography"/>
+    <w:qFormat/>
+    <w:pPr/>
+    <w:rPr/>
+  </w:style>
+  <w:style w:type="paragraph" w:styleId="Heading1">
+    <w:name w:val="heading 1"/>
+    <w:basedOn w:val="Normal"/>
+    <w:next w:val="BodyText"/>
+    <w:qFormat/>
+    <w:pPr>
+      <w:keepNext/>
+      <w:keepLines/>
+      <w:spacing w:before="0" w:after="0" w:line="480" w:lineRule="exact"/>
+      <w:ind w:firstLine="0"/>
+      <w:jc w:val="center"/>
+      <w:outlineLvl w:val="0"/>
+    </w:pPr>
+    <w:rPr>
+      <w:b/>
+      <w:bCs/>
       <w:color w:val="000000"/>
-    </w:rPr>
+      <w:sz w:val="24"/>
+      <w:szCs w:val="24"/>
+    </w:rPr>
+  </w:style>
+  <w:style w:type="paragraph" w:styleId="Heading2">
+    <w:name w:val="heading 2"/>
+    <w:basedOn w:val="Normal"/>
+    <w:next w:val="BodyText"/>
+    <w:qFormat/>
+    <w:pPr>
+      <w:keepNext/>
+      <w:keepLines/>
+      <w:spacing w:before="0" w:after="0" w:line="480" w:lineRule="exact"/>
+      <w:ind w:firstLine="0"/>
+      <w:outlineLvl w:val="1"/>
+    </w:pPr>
+    <w:rPr>
+      <w:b/>
+      <w:bCs/>
+      <w:color w:val="000000"/>
+      <w:sz w:val="24"/>
+      <w:szCs w:val="24"/>
+    </w:rPr>
+  </w:style>
+  <w:style w:type="paragraph" w:styleId="Heading3">
+    <w:name w:val="heading 3"/>
+    <w:basedOn w:val="Normal"/>
+    <w:next w:val="BodyText"/>
+    <w:qFormat/>
+    <w:pPr>
+      <w:keepNext/>
+      <w:keepLines/>
+      <w:spacing w:before="0" w:after="0" w:line="480" w:lineRule="exact"/>
+      <w:ind w:firstLine="0"/>
+      <w:outlineLvl w:val="2"/>
+    </w:pPr>
+    <w:rPr>
+      <w:b/>
+      <w:bCs/>
+      <w:i/>
+      <w:iCs/>
+      <w:color w:val="000000"/>
+      <w:sz w:val="24"/>
+      <w:szCs w:val="24"/>
+    </w:rPr>
+  </w:style>
+  <w:style w:type="paragraph" w:styleId="Heading4">
+    <w:name w:val="heading 4"/>
+    <w:basedOn w:val="Normal"/>
+    <w:next w:val="BodyText"/>
+    <w:link w:val="Heading4Char"/>
+    <w:uiPriority w:val="9"/>
+    <w:semiHidden/>
+    <w:unhideWhenUsed/>
+    <w:qFormat/>
+    <w:rsid w:val="00A10FD9"/>
+    <w:pPr>
+      <w:keepNext/>
+      <w:keepLines/>
+      <w:spacing w:before="0" w:after="0" w:line="480" w:lineRule="exact"/>
+      <w:ind w:firstLine="0"/>
+      <w:outlineLvl w:val="3"/>
+    </w:pPr>
+    <w:rPr>
+      <w:rFonts w:ascii="Times New Roman" w:hAnsi="Times New Roman" w:eastAsia="Times New Roman" w:cs="Times New Roman"/>
+      <w:b/>
+      <w:bCs/>
+      <w:i/>
+      <w:color w:val="000000"/>
+      <w:sz w:val="24"/>
+      <w:szCs w:val="24"/>
+    </w:rPr>
+  </w:style>
+  <w:style w:type="paragraph" w:styleId="Heading5">
+    <w:name w:val="heading 5"/>
+    <w:basedOn w:val="Normal"/>
+    <w:next w:val="BodyText"/>
+    <w:link w:val="Heading5Char"/>
+    <w:uiPriority w:val="9"/>
+    <w:semiHidden/>
+    <w:unhideWhenUsed/>
+    <w:qFormat/>
+    <w:rsid w:val="00A10FD9"/>
+    <w:pPr>
+      <w:keepNext/>
+      <w:keepLines/>
+      <w:spacing w:before="0" w:after="0" w:line="480" w:lineRule="exact"/>
+      <w:ind w:firstLine="0"/>
+      <w:outlineLvl w:val="4"/>
+    </w:pPr>
+    <w:rPr>
+      <w:rFonts w:ascii="Times New Roman" w:hAnsi="Times New Roman" w:eastAsia="Times New Roman" w:cs="Times New Roman"/>
+      <w:b/>
+      <w:bCs/>
+      <w:i/>
+      <w:color w:val="000000"/>
+      <w:sz w:val="24"/>
+      <w:szCs w:val="24"/>
+    </w:rPr>
+  </w:style>
+  <w:style w:type="paragraph" w:styleId="Heading6">
+    <w:name w:val="heading 6"/>
+    <w:basedOn w:val="Normal"/>
+    <w:next w:val="BodyText"/>
+    <w:link w:val="Heading6Char"/>
+    <w:uiPriority w:val="9"/>
+    <w:semiHidden/>
+    <w:unhideWhenUsed/>
+    <w:qFormat/>
+    <w:rsid w:val="00A10FD9"/>
+    <w:pPr>
+      <w:keepNext/>
+      <w:keepLines/>
+      <w:spacing w:before="40" w:after="0"/>
+      <w:outlineLvl w:val="5"/>
+    </w:pPr>
+    <w:rPr>
+      <w:rFonts w:eastAsiaTheme="majorEastAsia" w:cstheme="majorBidi"/>
+      <w:i/>
+      <w:iCs/>
+      <w:color w:val="595959" w:themeColor="text1" w:themeTint="A6"/>
+    </w:rPr>
+  </w:style>
+  <w:style w:type="paragraph" w:styleId="Heading7">
+    <w:name w:val="heading 7"/>
+    <w:basedOn w:val="Normal"/>
+    <w:next w:val="BodyText"/>
+    <w:link w:val="Heading7Char"/>
+    <w:uiPriority w:val="9"/>
+    <w:semiHidden/>
+    <w:unhideWhenUsed/>
+    <w:qFormat/>
+    <w:rsid w:val="00A10FD9"/>
+    <w:pPr>
+      <w:keepNext/>
+      <w:keepLines/>
+      <w:spacing w:before="40" w:after="0"/>
+      <w:outlineLvl w:val="6"/>
+    </w:pPr>
+    <w:rPr>
+      <w:rFonts w:eastAsiaTheme="majorEastAsia" w:cstheme="majorBidi"/>
+      <w:color w:val="595959" w:themeColor="text1" w:themeTint="A6"/>
+    </w:rPr>
+  </w:style>
+  <w:style w:type="paragraph" w:styleId="Heading8">
+    <w:name w:val="heading 8"/>
+    <w:basedOn w:val="Normal"/>
+    <w:next w:val="BodyText"/>
+    <w:link w:val="Heading8Char"/>
+    <w:uiPriority w:val="9"/>
+    <w:semiHidden/>
+    <w:unhideWhenUsed/>
+    <w:qFormat/>
+    <w:rsid w:val="00A10FD9"/>
+    <w:pPr>
+      <w:keepNext/>
+      <w:keepLines/>
+      <w:spacing w:after="0"/>
+      <w:outlineLvl w:val="7"/>
+    </w:pPr>
+    <w:rPr>
+      <w:rFonts w:eastAsiaTheme="majorEastAsia" w:cstheme="majorBidi"/>
+      <w:i/>
+      <w:iCs/>
+      <w:color w:val="272727" w:themeColor="text1" w:themeTint="D8"/>
+    </w:rPr>
+  </w:style>
+  <w:style w:type="paragraph" w:styleId="Heading9">
+    <w:name w:val="heading 9"/>
+    <w:basedOn w:val="Normal"/>
+    <w:next w:val="BodyText"/>
+    <w:link w:val="Heading9Char"/>
+    <w:uiPriority w:val="9"/>
+    <w:semiHidden/>
+    <w:unhideWhenUsed/>
+    <w:qFormat/>
+    <w:rsid w:val="00A10FD9"/>
+    <w:pPr>
+      <w:keepNext/>
+      <w:keepLines/>
+      <w:spacing w:after="0"/>
+      <w:outlineLvl w:val="8"/>
+    </w:pPr>
+    <w:rPr>
+      <w:rFonts w:eastAsiaTheme="majorEastAsia" w:cstheme="majorBidi"/>
+      <w:color w:val="272727" w:themeColor="text1" w:themeTint="D8"/>
+    </w:rPr>
+  </w:style>
+  <w:style w:type="character" w:customStyle="1" w:styleId="Heading1Char">
+    <w:name w:val="Heading 1 Char"/>
+    <w:basedOn w:val="DefaultParagraphFont"/>
+    <w:link w:val="Heading1"/>
+    <w:uiPriority w:val="9"/>
+    <w:rsid w:val="00A10FD9"/>
+    <w:rPr>
+      <w:rFonts w:asciiTheme="majorHAnsi" w:eastAsiaTheme="majorEastAsia" w:hAnsiTheme="majorHAnsi" w:cstheme="majorBidi"/>
+      <w:color w:val="0F4761" w:themeColor="accent1" w:themeShade="BF"/>
+      <w:sz w:val="40"/>
+      <w:szCs w:val="40"/>
+    </w:rPr>
+  </w:style>
+  <w:style w:type="character" w:customStyle="1" w:styleId="Heading2Char">
+    <w:name w:val="Heading 2 Char"/>
+    <w:basedOn w:val="DefaultParagraphFont"/>
+    <w:link w:val="Heading2"/>
+    <w:uiPriority w:val="9"/>
+    <w:semiHidden/>
+    <w:rsid w:val="00A10FD9"/>
+    <w:rPr>
+      <w:rFonts w:asciiTheme="majorHAnsi" w:eastAsiaTheme="majorEastAsia" w:hAnsiTheme="majorHAnsi" w:cstheme="majorBidi"/>
+      <w:color w:val="0F4761" w:themeColor="accent1" w:themeShade="BF"/>
+      <w:sz w:val="32"/>
+      <w:szCs w:val="32"/>
+    </w:rPr>
+  </w:style>
+  <w:style w:type="character" w:customStyle="1" w:styleId="Heading3Char">
+    <w:name w:val="Heading 3 Char"/>
+    <w:basedOn w:val="DefaultParagraphFont"/>
+    <w:link w:val="Heading3"/>
+    <w:uiPriority w:val="9"/>
+    <w:semiHidden/>
+    <w:rsid w:val="00A10FD9"/>
+    <w:rPr>
+      <w:rFonts w:eastAsiaTheme="majorEastAsia" w:cstheme="majorBidi"/>
+      <w:color w:val="0F4761" w:themeColor="accent1" w:themeShade="BF"/>
+      <w:sz w:val="28"/>
+      <w:szCs w:val="28"/>
+    </w:rPr>
+  </w:style>
+  <w:style w:type="character" w:customStyle="1" w:styleId="Heading4Char">
+    <w:name w:val="Heading 4 Char"/>
+    <w:basedOn w:val="DefaultParagraphFont"/>
+    <w:link w:val="Heading4"/>
+    <w:uiPriority w:val="9"/>
+    <w:semiHidden/>
+    <w:rsid w:val="00A10FD9"/>
+    <w:rPr>
+      <w:rFonts w:eastAsiaTheme="majorEastAsia" w:cstheme="majorBidi"/>
+      <w:i/>
+      <w:iCs/>
+      <w:color w:val="0F4761" w:themeColor="accent1" w:themeShade="BF"/>
+    </w:rPr>
+  </w:style>
+  <w:style w:type="character" w:customStyle="1" w:styleId="Heading5Char">
+    <w:name w:val="Heading 5 Char"/>
+    <w:basedOn w:val="DefaultParagraphFont"/>
+    <w:link w:val="Heading5"/>
+    <w:uiPriority w:val="9"/>
+    <w:semiHidden/>
+    <w:rsid w:val="00A10FD9"/>
+    <w:rPr>
+      <w:rFonts w:eastAsiaTheme="majorEastAsia" w:cstheme="majorBidi"/>
+      <w:color w:val="0F4761" w:themeColor="accent1" w:themeShade="BF"/>
+    </w:rPr>
+  </w:style>
+  <w:style w:type="character" w:customStyle="1" w:styleId="Heading6Char">
+    <w:name w:val="Heading 6 Char"/>
+    <w:basedOn w:val="DefaultParagraphFont"/>
+    <w:link w:val="Heading6"/>
+    <w:uiPriority w:val="9"/>
+    <w:semiHidden/>
+    <w:rsid w:val="00A10FD9"/>
+    <w:rPr>
+      <w:rFonts w:eastAsiaTheme="majorEastAsia" w:cstheme="majorBidi"/>
+      <w:i/>
+      <w:iCs/>
+      <w:color w:val="595959" w:themeColor="text1" w:themeTint="A6"/>
+    </w:rPr>
+  </w:style>
+  <w:style w:type="character" w:customStyle="1" w:styleId="Heading7Char">
+    <w:name w:val="Heading 7 Char"/>
+    <w:basedOn w:val="DefaultParagraphFont"/>
+    <w:link w:val="Heading7"/>
+    <w:uiPriority w:val="9"/>
+    <w:semiHidden/>
+    <w:rsid w:val="00A10FD9"/>
+    <w:rPr>
+      <w:rFonts w:eastAsiaTheme="majorEastAsia" w:cstheme="majorBidi"/>
+      <w:color w:val="595959" w:themeColor="text1" w:themeTint="A6"/>
+    </w:rPr>
+  </w:style>
+  <w:style w:type="character" w:customStyle="1" w:styleId="Heading8Char">
+    <w:name w:val="Heading 8 Char"/>
+    <w:basedOn w:val="DefaultParagraphFont"/>
+    <w:link w:val="Heading8"/>
+    <w:uiPriority w:val="9"/>
+    <w:semiHidden/>
+    <w:rsid w:val="00A10FD9"/>
+    <w:rPr>
+      <w:rFonts w:eastAsiaTheme="majorEastAsia" w:cstheme="majorBidi"/>
+      <w:i/>
+      <w:iCs/>
+      <w:color w:val="272727" w:themeColor="text1" w:themeTint="D8"/>
+    </w:rPr>
+  </w:style>
+  <w:style w:type="character" w:customStyle="1" w:styleId="Heading9Char">
+    <w:name w:val="Heading 9 Char"/>
+    <w:basedOn w:val="DefaultParagraphFont"/>
+    <w:link w:val="Heading9"/>
+    <w:uiPriority w:val="9"/>
+    <w:semiHidden/>
+    <w:rsid w:val="00A10FD9"/>
+    <w:rPr>
+      <w:rFonts w:eastAsiaTheme="majorEastAsia" w:cstheme="majorBidi"/>
+      <w:color w:val="272727" w:themeColor="text1" w:themeTint="D8"/>
+    </w:rPr>
+  </w:style>
+  <w:style w:type="paragraph" w:customStyle="1" w:styleId="ListItem">
+    <w:name w:val="List Item"/>
+    <w:basedOn w:val="BodyText"/>
+    <w:qFormat/>
+    <w:pPr>
+      <w:spacing w:before="0" w:after="0" w:line="480" w:lineRule="exact"/>
+      <w:ind w:left="720" w:hanging="720"/>
+    </w:pPr>
+  </w:style>
+  <w:style w:type="paragraph" w:styleId="BlockText">
+    <w:name w:val="Block Text"/>
+    <w:basedOn w:val="BodyText"/>
+    <w:next w:val="BodyText"/>
+    <w:uiPriority w:val="9"/>
+    <w:unhideWhenUsed/>
+    <w:qFormat/>
+    <w:pPr>
+      <w:spacing w:before="240" w:after="240" w:line="276" w:lineRule="exact"/>
+      <w:ind w:firstLine="0" w:left="720" w:right="720"/>
+    </w:pPr>
+  </w:style>
+  <w:style w:type="paragraph" w:styleId="FootnoteText">
+    <w:name w:val="Footnote Text"/>
+    <w:basedOn w:val="Normal"/>
+    <w:next w:val="FootnoteText"/>
+    <w:uiPriority w:val="9"/>
+    <w:unhideWhenUsed/>
+    <w:qFormat/>
+    <w:pPr>
+      <w:keepLines/>
+      <w:spacing w:before="0" w:after="140" w:line="276" w:lineRule="exact"/>
+    </w:pPr>
+    <w:rPr>
+      <w:sz w:val="24"/>
+      <w:szCs w:val="24"/>
+    </w:rPr>
+  </w:style>
+  <w:style w:type="paragraph" w:styleId="FootnoteBlockText">
+    <w:name w:val="Footnote Block Text"/>
+    <w:basedOn w:val="FootnoteText"/>
+    <w:next w:val="FootnoteText"/>
+    <w:uiPriority w:val="9"/>
+    <w:unhideWhenUsed/>
+    <w:qFormat/>
+    <w:pPr>
+      <w:spacing w:before="240" w:after="240"/>
+      <w:ind w:firstLine="0" w:left="720" w:right="720"/>
+    </w:pPr>
   </w:style>
   <w:style w:type="character" w:default="1" w:styleId="DefaultParagraphFont">
     <w:name w:val="Default Paragraph Font"/>
-    <w:uiPriority w:val="1"/>
     <w:semiHidden/>
     <w:unhideWhenUsed/>
   </w:style>
-  <w:style w:type="table" w:default="1" w:styleId="TableNormal">
-    <w:name w:val="Normal Table"/>
-    <w:uiPriority w:val="99"/>
-    <w:semiHidden/>
-    <w:unhideWhenUsed/>
+  <w:style w:type="table" w:default="1" w:styleId="Table">
+    <w:name w:val="Table"/>
+    <w:basedOn w:val="TableNormal"/>
+    <w:qFormat/>
     <w:tblPr>
       <w:tblInd w:w="0" w:type="dxa"/>
       <w:tblCellMar>
@@ -951,308 +1777,125 @@
         <w:right w:w="108" w:type="dxa"/>
       </w:tblCellMar>
     </w:tblPr>
-  </w:style>
-  <w:style w:type="numbering" w:default="1" w:styleId="NoList">
-    <w:name w:val="No List"/>
-    <w:uiPriority w:val="99"/>
-    <w:semiHidden/>
-    <w:unhideWhenUsed/>
-  </w:style>
-  <w:style w:type="paragraph" w:styleId="BodyText">
-    <w:name w:val="Body Text"/>
+    <w:tblStylePr w:type="firstRow">
+      <w:tcPr>
+        <w:tcBorders>
+          <w:bottom w:val="single"/>
+        </w:tcBorders>
+        <w:vAlign w:val="bottom"/>
+      </w:tcPr>
+    </w:tblStylePr>
+  </w:style>
+  <w:style w:type="paragraph" w:customStyle="1" w:styleId="DefinitionTerm">
+    <w:name w:val="Definition Term"/>
     <w:basedOn w:val="Normal"/>
-    <w:qFormat/>
-    <w:pPr>
-      <w:spacing w:before="0" w:after="130" w:line="480" w:lineRule="exact"/>
-      <w:ind w:firstLine="0"/>
-    </w:pPr>
-  </w:style>
-  <w:style w:type="paragraph" w:customStyle="1" w:styleId="FirstParagraph">
-    <w:name w:val="First Paragraph"/>
-    <w:basedOn w:val="BodyText"/>
-    <w:next w:val="BodyText"/>
-    <w:qFormat/>
-  </w:style>
-  <w:style w:type="paragraph" w:customStyle="1" w:styleId="Compact">
-    <w:name w:val="Compact"/>
-    <w:basedOn w:val="BodyText"/>
-    <w:qFormat/>
-    <w:pPr>
-      <w:spacing w:before="0" w:after="0"/>
-    </w:pPr>
-  </w:style>
-  <w:style w:type="paragraph" w:customStyle="1" w:styleId="BodyKeep">
-    <w:name w:val="BodyKeep"/>
-    <w:basedOn w:val="BodyText"/>
-    <w:qFormat/>
+    <w:next w:val="Definition"/>
     <w:pPr>
       <w:keepNext/>
       <w:keepLines/>
-    </w:pPr>
-  </w:style>
-  <w:style w:type="paragraph" w:customStyle="1" w:styleId="NumberedPara">
-    <w:name w:val="NumberedPara"/>
-    <w:basedOn w:val="BodyText"/>
-    <w:qFormat/>
-    <w:pPr>
-      <w:tabs>
-        <w:tab w:val="left" w:pos="1620"/>
-      </w:tabs>
-      <w:ind w:left="1620" w:hanging="900"/>
-    </w:pPr>
-  </w:style>
-  <w:style w:type="paragraph" w:customStyle="1" w:styleId="NumberedKeep">
-    <w:name w:val="NumberedKeep"/>
-    <w:basedOn w:val="NumberedPara"/>
-    <w:qFormat/>
+      <w:spacing w:after="0"/>
+    </w:pPr>
+    <w:rPr>
+      <w:b/>
+    </w:rPr>
+  </w:style>
+  <w:style w:type="paragraph" w:customStyle="1" w:styleId="Definition">
+    <w:name w:val="Definition"/>
+    <w:basedOn w:val="Normal"/>
+  </w:style>
+  <w:style w:type="paragraph" w:styleId="Caption">
+    <w:name w:val="Caption"/>
+    <w:basedOn w:val="Normal"/>
+    <w:link w:val="BodyTextChar"/>
+    <w:pPr>
+      <w:spacing w:before="0" w:after="120"/>
+    </w:pPr>
+    <w:rPr>
+      <w:i/>
+    </w:rPr>
+  </w:style>
+  <w:style w:type="paragraph" w:customStyle="1" w:styleId="TableCaption">
+    <w:name w:val="Table Caption"/>
+    <w:basedOn w:val="Caption"/>
     <w:pPr>
       <w:keepNext/>
-      <w:keepLines/>
-    </w:pPr>
-  </w:style>
-  <w:style w:type="paragraph" w:styleId="BlockText">
-    <w:name w:val="Block Text"/>
+    </w:pPr>
+  </w:style>
+  <w:style w:type="paragraph" w:customStyle="1" w:styleId="ImageCaption">
+    <w:name w:val="Image Caption"/>
+    <w:basedOn w:val="Caption"/>
+  </w:style>
+  <w:style w:type="paragraph" w:customStyle="1" w:styleId="Figure">
+    <w:name w:val="Figure"/>
     <w:basedOn w:val="Normal"/>
-    <w:next w:val="BodyText"/>
-    <w:qFormat/>
-    <w:pPr>
-      <w:spacing w:before="0" w:after="130" w:line="288" w:lineRule="exact"/>
-      <w:ind w:left="720" w:right="720" w:firstLine="0"/>
-    </w:pPr>
-  </w:style>
-  <w:style w:type="paragraph" w:styleId="Heading1">
-    <w:name w:val="heading 1"/>
-    <w:basedOn w:val="BodyText"/>
-    <w:next w:val="BodyText"/>
-    <w:qFormat/>
+  </w:style>
+  <w:style w:type="paragraph" w:customStyle="1" w:styleId="CaptionedFigure">
+    <w:name w:val="Captioned Figure"/>
+    <w:basedOn w:val="Figure"/>
     <w:pPr>
       <w:keepNext/>
-      <w:keepLines/>
-      <w:spacing w:before="0" w:after="130" w:line="480" w:lineRule="exact"/>
-      <w:jc w:val="center"/>
-      <w:outlineLvl w:val="0"/>
-    </w:pPr>
-    <w:rPr>
-      <w:b/>
-      <w:bCs/>
-    </w:rPr>
-  </w:style>
-  <w:style w:type="paragraph" w:styleId="Heading2">
-    <w:name w:val="heading 2"/>
-    <w:basedOn w:val="BodyText"/>
-    <w:next w:val="BodyText"/>
-    <w:qFormat/>
-    <w:pPr>
-      <w:keepNext/>
-      <w:keepLines/>
-      <w:spacing w:before="0" w:after="130" w:line="480" w:lineRule="exact"/>
-      <w:ind w:firstLine="0"/>
-      <w:outlineLvl w:val="1"/>
-    </w:pPr>
-    <w:rPr>
-      <w:b/>
-      <w:bCs/>
-    </w:rPr>
-  </w:style>
-  <w:style w:type="paragraph" w:styleId="Heading3">
-    <w:name w:val="heading 3"/>
-    <w:basedOn w:val="Heading2"/>
-    <w:next w:val="BodyText"/>
-    <w:qFormat/>
-    <w:pPr>
-      <w:outlineLvl w:val="2"/>
-    </w:pPr>
-    <w:rPr>
-      <w:i/>
-      <w:iCs/>
-    </w:rPr>
-  </w:style>
-  <w:style w:type="paragraph" w:styleId="Heading4">
-    <w:name w:val="heading 4"/>
-    <w:basedOn w:val="Heading2"/>
-    <w:next w:val="BodyText"/>
-    <w:qFormat/>
-    <w:pPr>
-      <w:outlineLvl w:val="3"/>
-    </w:pPr>
-  </w:style>
-  <w:style w:type="paragraph" w:styleId="Heading5">
-    <w:name w:val="heading 5"/>
-    <w:basedOn w:val="Heading2"/>
-    <w:next w:val="BodyText"/>
-    <w:qFormat/>
-    <w:pPr>
-      <w:outlineLvl w:val="4"/>
-    </w:pPr>
-  </w:style>
-  <w:style w:type="paragraph" w:customStyle="1" w:styleId="Single">
-    <w:name w:val="Single"/>
-    <w:basedOn w:val="Normal"/>
-    <w:qFormat/>
-    <w:pPr>
-      <w:spacing w:before="0" w:after="0" w:line="276" w:lineRule="exact"/>
-      <w:ind w:firstLine="0"/>
-    </w:pPr>
-  </w:style>
-  <w:style w:type="paragraph" w:customStyle="1" w:styleId="SingleKeep">
-    <w:name w:val="SingleKeep"/>
-    <w:basedOn w:val="Single"/>
-    <w:qFormat/>
-    <w:pPr>
-      <w:keepNext/>
-      <w:keepLines/>
-    </w:pPr>
-  </w:style>
-  <w:style w:type="paragraph" w:customStyle="1" w:styleId="Centered">
-    <w:name w:val="Centered"/>
-    <w:basedOn w:val="Single"/>
-    <w:qFormat/>
-    <w:pPr>
-      <w:jc w:val="center"/>
-    </w:pPr>
-  </w:style>
-  <w:style w:type="paragraph" w:customStyle="1" w:styleId="CourtTitle">
-    <w:name w:val="Court Title"/>
-    <w:basedOn w:val="Centered"/>
-    <w:qFormat/>
-    <w:pPr>
-      <w:spacing w:line="480" w:lineRule="exact"/>
-    </w:pPr>
-    <w:rPr>
-      <w:b/>
-      <w:bCs/>
-    </w:rPr>
-  </w:style>
-  <w:style w:type="paragraph" w:customStyle="1" w:styleId="CenteredHead">
-    <w:name w:val="CenteredHead"/>
-    <w:basedOn w:val="BodyText"/>
-    <w:qFormat/>
-    <w:pPr>
-      <w:keepNext/>
-      <w:keepLines/>
-      <w:jc w:val="center"/>
-    </w:pPr>
-    <w:rPr>
-      <w:b/>
-      <w:bCs/>
-    </w:rPr>
-  </w:style>
-  <w:style w:type="paragraph" w:customStyle="1" w:styleId="Gap16">
-    <w:name w:val="Gap16"/>
-    <w:basedOn w:val="Single"/>
-    <w:qFormat/>
-    <w:pPr>
-      <w:keepNext/>
-      <w:spacing w:line="324" w:lineRule="exact"/>
-    </w:pPr>
-  </w:style>
-  <w:style w:type="paragraph" w:customStyle="1" w:styleId="Gap6">
-    <w:name w:val="Gap6"/>
-    <w:basedOn w:val="Single"/>
-    <w:qFormat/>
-    <w:pPr>
-      <w:keepNext/>
-      <w:spacing w:line="120" w:lineRule="exact"/>
-    </w:pPr>
-  </w:style>
-  <w:style w:type="paragraph" w:customStyle="1" w:styleId="Gap8">
-    <w:name w:val="Gap8"/>
-    <w:basedOn w:val="Single"/>
-    <w:qFormat/>
-    <w:pPr>
-      <w:keepNext/>
-      <w:spacing w:line="162" w:lineRule="exact"/>
-    </w:pPr>
-  </w:style>
-  <w:style w:type="paragraph" w:styleId="FootnoteText">
-    <w:name w:val="footnote text"/>
-    <w:basedOn w:val="Normal"/>
-    <w:uiPriority w:val="99"/>
-    <w:unhideWhenUsed/>
-    <w:pPr>
-      <w:spacing w:before="0" w:after="60" w:line="240" w:lineRule="auto"/>
-      <w:ind w:firstLine="0"/>
-    </w:pPr>
-    <w:rPr>
-      <w:sz w:val="20"/>
-      <w:szCs w:val="20"/>
-    </w:rPr>
+    </w:pPr>
+  </w:style>
+  <w:style w:type="character" w:customStyle="1" w:styleId="BodyTextChar">
+    <w:name w:val="Body Text Char"/>
+    <w:basedOn w:val="DefaultParagraphFont"/>
+    <w:link w:val="BodyText"/>
+  </w:style>
+  <w:style w:type="character" w:customStyle="1" w:styleId="VerbatimChar">
+    <w:name w:val="Verbatim Char"/>
+    <w:basedOn w:val="BodyTextChar"/>
+    <w:rPr>
+      <w:rFonts w:ascii="Consolas" w:hAnsi="Consolas"/>
+      <w:sz w:val="22"/>
+    </w:rPr>
+  </w:style>
+  <w:style w:type="character" w:customStyle="1" w:styleId="SectionNumber">
+    <w:name w:val="Section Number"/>
+    <w:basedOn w:val="BodyTextChar"/>
   </w:style>
   <w:style w:type="character" w:styleId="FootnoteReference">
-    <w:name w:val="footnote reference"/>
-    <w:basedOn w:val="DefaultParagraphFont"/>
-    <w:uiPriority w:val="99"/>
-    <w:unhideWhenUsed/>
+    <w:name w:val="Footnote Reference"/>
+    <w:basedOn w:val="BodyTextChar"/>
     <w:rPr>
       <w:vertAlign w:val="superscript"/>
-    </w:rPr>
-  </w:style>
-  <w:style w:type="paragraph" w:styleId="Footer">
-    <w:name w:val="footer"/>
-    <w:basedOn w:val="Normal"/>
-    <w:uiPriority w:val="99"/>
-    <w:unhideWhenUsed/>
-    <w:pPr>
-      <w:tabs>
-        <w:tab w:val="center" w:pos="4680"/>
-        <w:tab w:val="right" w:pos="9360"/>
-      </w:tabs>
-      <w:spacing w:before="0" w:after="0" w:line="240" w:lineRule="auto"/>
-      <w:jc w:val="center"/>
-    </w:pPr>
-    <w:rPr>
-      <w:sz w:val="20"/>
-      <w:szCs w:val="20"/>
     </w:rPr>
   </w:style>
   <w:style w:type="character" w:styleId="Hyperlink">
     <w:name w:val="Hyperlink"/>
-    <w:basedOn w:val="DefaultParagraphFont"/>
-    <w:uiPriority w:val="99"/>
+    <w:basedOn w:val="BodyTextChar"/>
+    <w:rPr>
+      <w:color w:val="000000"/>
+    </w:rPr>
+  </w:style>
+  <w:style w:type="paragraph" w:styleId="TOCHeading">
+    <w:name w:val="TOC Heading"/>
+    <w:basedOn w:val="Heading1"/>
+    <w:next w:val="BodyText"/>
+    <w:uiPriority w:val="39"/>
     <w:unhideWhenUsed/>
-    <w:rPr>
-      <w:color w:val="000000"/>
-      <w:u w:val="single"/>
-    </w:rPr>
-  </w:style>
-  <w:style w:type="character" w:styleId="VerbatimChar">
-    <w:name w:val="Verbatim Char"/>
-    <w:basedOn w:val="DefaultParagraphFont"/>
-    <w:rPr>
-      <w:rFonts w:ascii="EB Garamond" w:hAnsi="EB Garamond"/>
-    </w:rPr>
-  </w:style>
-  <w:style w:type="paragraph" w:styleId="Caption">
-    <w:name w:val="caption"/>
-    <w:basedOn w:val="Normal"/>
-    <w:qFormat/>
-    <w:pPr>
-      <w:spacing w:after="120"/>
-    </w:pPr>
-  </w:style>
-  <w:style w:type="paragraph" w:styleId="TableCaption">
-    <w:name w:val="Table Caption"/>
-    <w:basedOn w:val="Caption"/>
-    <w:qFormat/>
-  </w:style>
-  <w:style w:type="paragraph" w:styleId="ImageCaption">
-    <w:name w:val="Image Caption"/>
-    <w:basedOn w:val="Caption"/>
-    <w:qFormat/>
-  </w:style>
-  <w:style w:type="table" w:styleId="Table">
-    <w:name w:val="Table"/>
-    <w:basedOn w:val="TableNormal"/>
-    <w:tblPr>
-      <w:tblBorders>
-        <w:top w:val="nil"/>
-        <w:left w:val="nil"/>
-        <w:bottom w:val="nil"/>
-        <w:right w:val="nil"/>
-        <w:insideH w:val="nil"/>
-        <w:insideV w:val="nil"/>
-      </w:tblBorders>
-    </w:tblPr>
+    <w:qFormat/>
+    <w:pPr>
+      <w:spacing w:before="240" w:line="259" w:lineRule="auto"/>
+      <w:outlineLvl w:val="9"/>
+    </w:pPr>
+    <w:rPr>
+      <w:rFonts w:asciiTheme="majorHAnsi" w:eastAsiaTheme="majorEastAsia" w:hAnsiTheme="majorHAnsi" w:cstheme="majorBidi"/>
+      <w:b w:val="0"/>
+      <w:bCs w:val="0"/>
+      <w:color w:val="365F91" w:themeColor="accent1" w:themeShade="BF"/>
+    </w:rPr>
+  </w:style>
+  <w:style w:type="paragraph" w:customStyle="1" w:styleId="NumberedParagraph">
+    <w:name w:val="Numbered Paragraph"/>
+    <w:basedOn w:val="BodyText"/>
+    <w:qFormat/>
+    <w:pPr>
+      <w:tabs>
+        <w:tab w:val="left" w:pos="1440"/>
+      </w:tabs>
+      <w:spacing w:before="0" w:after="0" w:line="480" w:lineRule="exact"/>
+      <w:ind w:left="1440" w:hanging="720"/>
+    </w:pPr>
   </w:style>
   <w:style w:type="paragraph" w:customStyle="1" w:styleId="SourceCode">
     <w:name w:val="Source Code"/>

</xml_diff>